<commit_message>
feat: refresh public AitlasQM starter for QM 0.1.12
</commit_message>
<xml_diff>
--- a/docs/AitlasQM-Setup-Manual.docx
+++ b/docs/AitlasQM-Setup-Manual.docx
@@ -167,7 +167,7 @@
           <w:color w:val="334155"/>
           <w:sz w:val="21"/>
         </w:rPr>
-        <w:t>This guide is for the person who uses the public template at https://github.com/syedahmad0786/aitlasqm-deploy-starter to install AitlasQM inside a new company's own infrastructure. It is not an internal ChiroCandy operator guide. Complete the sections in order and do not reuse any production company's values.</w:t>
+        <w:t>This guide is for the person who uses the public template at https://github.com/billysticker/aitlasqm-deploy-starter to install AitlasQM inside a new company's own infrastructure. It is not an internal ChiroCandy operator guide. Complete the sections in order and do not reuse any production company's values.</w:t>
       </w:r>
     </w:p>
     <w:p>
@@ -4593,7 +4593,7 @@
           <w:color w:val="334155"/>
           <w:sz w:val="21"/>
         </w:rPr>
-        <w:t>The class share link is https://github.com/syedahmad0786/aitlasqm-deploy-starter. The destination must be a private repository owned by your company. Do not request or use access to a live deployment repository.</w:t>
+        <w:t>The class share link is https://github.com/billysticker/aitlasqm-deploy-starter. The destination must be a private repository owned by your company. Do not request or use access to a live deployment repository.</w:t>
       </w:r>
     </w:p>
     <w:p>
@@ -4706,7 +4706,7 @@
         </w:rPr>
         <w:t>cd ~/work</w:t>
         <w:br/>
-        <w:t>gh repo create &lt;customer-owner&gt;/&lt;customer-repo&gt; --private --template syedahmad0786/aitlasqm-deploy-starter --clone</w:t>
+        <w:t>gh repo create &lt;customer-owner&gt;/&lt;customer-repo&gt; --private --template billysticker/aitlasqm-deploy-starter --clone</w:t>
         <w:br/>
         <w:t>cd &lt;customer-repo&gt;</w:t>
         <w:br/>
@@ -6301,7 +6301,7 @@
         <w:ind w:left="691"/>
       </w:pPr>
       <w:r>
-        <w:t>The reviewed repository pins @yc-software/qm 0.1.4. If the delivered commit changes, record the new version.</w:t>
+        <w:t>The reviewed repository pins @yc-software/qm 0.1.12. If the delivered commit changes, record the new version.</w:t>
       </w:r>
     </w:p>
     <w:p>
@@ -13163,6 +13163,63 @@
         <w:t>Provider interfaces and commands change. Before a new deployment, compare this manual with the delivered repository commit and the linked official provider documentation.</w:t>
       </w:r>
     </w:p>
+    <w:p>
+      <w:r>
+        <w:br w:type="page"/>
+      </w:r>
+    </w:p>
+    <w:p>
+      <w:pPr>
+        <w:pStyle w:val="Heading1"/>
+      </w:pPr>
+      <w:r>
+        <w:t>September 2026 template refresh</w:t>
+      </w:r>
+    </w:p>
+    <w:p>
+      <w:r>
+        <w:t>The public template now pins @yc-software/qm 0.1.12 and applies its AitlasQM web UI changes to the reviewed upstream revision. Use the current README and deployment.md for commands; do not reuse an image built from the older patch series.</w:t>
+      </w:r>
+    </w:p>
+    <w:p>
+      <w:pPr>
+        <w:pStyle w:val="Heading2"/>
+      </w:pPr>
+      <w:r>
+        <w:t>Specialist rooms</w:t>
+      </w:r>
+    </w:p>
+    <w:p>
+      <w:r>
+        <w:t>Create private Slack channels or QM room contexts for each mission. The room-skills directory contains editable image-design and landing-page examples. These are not installed automatically. Review each room’s members, tools, model access, credentials, and human approval rules before publishing its skill through the QM Skills editor.</w:t>
+      </w:r>
+    </w:p>
+    <w:p>
+      <w:pPr>
+        <w:pStyle w:val="Heading2"/>
+      </w:pPr>
+      <w:r>
+        <w:t>Company Brain</w:t>
+      </w:r>
+    </w:p>
+    <w:p>
+      <w:r>
+        <w:t>QM includes scoped memory. The Brain Map interface can be connected to a separate, customer-owned knowledge service only after its identity, source grants, ingestion consent, and isolation checks are configured. This template does not deploy the ChiroCandy Brain service. Read docs/COMPANY-BRAIN-ADOPTION.md before enabling a knowledge integration.</w:t>
+      </w:r>
+    </w:p>
+    <w:p>
+      <w:pPr>
+        <w:pStyle w:val="Heading2"/>
+      </w:pPr>
+      <w:r>
+        <w:t>Customer branding</w:t>
+      </w:r>
+    </w:p>
+    <w:p>
+      <w:r>
+        <w:t>Set the customer’s final botName and QM_BRAND_MARK_URL for web UI and admin. The starter placeholders and the included AitlasQM logo are examples. Never copy another company’s production URL, private image digest, staff email, Slack team ID, or provider secret into a customer repository.</w:t>
+      </w:r>
+    </w:p>
     <w:sectPr>
       <w:headerReference w:type="default" r:id="rId20"/>
       <w:footerReference w:type="default" r:id="rId21"/>

</xml_diff>